<commit_message>
Commit message describing your changes 1404-02-16-001
</commit_message>
<xml_diff>
--- a/Documents/شرح بهینه سیستم تنخواه گردان.docx
+++ b/Documents/شرح بهینه سیستم تنخواه گردان.docx
@@ -1998,7 +1998,7 @@
           <w:szCs w:val="26"/>
         </w:rPr>
         <w:pict w14:anchorId="482D01DC">
-          <v:rect id="_x0000_i1099" style="width:0;height:1.5pt" o:hralign="center" o:hrstd="t" o:hrnoshade="t" o:hr="t" fillcolor="black" stroked="f"/>
+          <v:rect id="_x0000_i1025" style="width:0;height:1.5pt" o:hralign="center" o:hrstd="t" o:hrnoshade="t" o:hr="t" fillcolor="black" stroked="f"/>
         </w:pict>
       </w:r>
     </w:p>
@@ -2946,6 +2946,7 @@
           <w:rFonts w:cs="B Mitra"/>
           <w:i w:val="0"/>
           <w:iCs w:val="0"/>
+          <w:noProof/>
           <w:sz w:val="26"/>
           <w:szCs w:val="26"/>
         </w:rPr>
@@ -3053,6 +3054,7 @@
           <w:rFonts w:cs="B Mitra"/>
           <w:i w:val="0"/>
           <w:iCs w:val="0"/>
+          <w:noProof/>
           <w:sz w:val="26"/>
           <w:szCs w:val="26"/>
         </w:rPr>
@@ -3160,6 +3162,7 @@
           <w:rFonts w:cs="B Mitra"/>
           <w:i w:val="0"/>
           <w:iCs w:val="0"/>
+          <w:noProof/>
           <w:sz w:val="26"/>
           <w:szCs w:val="26"/>
         </w:rPr>
@@ -3267,6 +3270,7 @@
           <w:rFonts w:cs="B Mitra"/>
           <w:i w:val="0"/>
           <w:iCs w:val="0"/>
+          <w:noProof/>
           <w:sz w:val="26"/>
           <w:szCs w:val="26"/>
         </w:rPr>
@@ -3788,7 +3792,6 @@
           <w:szCs w:val="26"/>
           <w:rtl/>
         </w:rPr>
-        <w:lastRenderedPageBreak/>
         <w:t xml:space="preserve">متن: (خالی - دمو نشون بده) </w:t>
       </w:r>
     </w:p>
@@ -4972,7 +4975,6 @@
           <w:szCs w:val="26"/>
           <w:rtl/>
         </w:rPr>
-        <w:lastRenderedPageBreak/>
         <w:t xml:space="preserve">انیمیشن: </w:t>
       </w:r>
       <w:r>
@@ -5023,7 +5025,7 @@
           <w:szCs w:val="26"/>
         </w:rPr>
         <w:pict w14:anchorId="1DFAC2F6">
-          <v:rect id="_x0000_i1053" style="width:0;height:1.5pt" o:hralign="center" o:hrstd="t" o:hrnoshade="t" o:hr="t" fillcolor="black" stroked="f"/>
+          <v:rect id="_x0000_i1026" style="width:0;height:1.5pt" o:hralign="center" o:hrstd="t" o:hrnoshade="t" o:hr="t" fillcolor="black" stroked="f"/>
         </w:pict>
       </w:r>
     </w:p>
@@ -5332,7 +5334,7 @@
           <w:szCs w:val="26"/>
         </w:rPr>
         <w:pict w14:anchorId="38161123">
-          <v:rect id="_x0000_i1054" style="width:0;height:1.5pt" o:hralign="center" o:hrstd="t" o:hrnoshade="t" o:hr="t" fillcolor="black" stroked="f"/>
+          <v:rect id="_x0000_i1027" style="width:0;height:1.5pt" o:hralign="center" o:hrstd="t" o:hrnoshade="t" o:hr="t" fillcolor="black" stroked="f"/>
         </w:pict>
       </w:r>
     </w:p>

</xml_diff>